<commit_message>
v3, prefinal, list of figures not added
</commit_message>
<xml_diff>
--- a/diss-word/dissertation.docx
+++ b/diss-word/dissertation.docx
@@ -388,7 +388,31 @@
           <w:u w:val="single"/>
           <w:lang w:bidi="en-US"/>
         </w:rPr>
-        <w:t>PROFESSOR SHAKTI KUMAR</w:t>
+        <w:t>PROF</w:t>
+      </w:r>
+      <w:r>
+        <w:rPr>
+          <w:rFonts w:ascii="Garamond" w:eastAsia="Calibri" w:hAnsi="Garamond"/>
+          <w:b/>
+          <w:i/>
+          <w:sz w:val="32"/>
+          <w:szCs w:val="32"/>
+          <w:u w:val="single"/>
+          <w:lang w:bidi="en-US"/>
+        </w:rPr>
+        <w:t xml:space="preserve">. </w:t>
+      </w:r>
+      <w:r>
+        <w:rPr>
+          <w:rFonts w:ascii="Garamond" w:eastAsia="Calibri" w:hAnsi="Garamond"/>
+          <w:b/>
+          <w:i/>
+          <w:sz w:val="32"/>
+          <w:szCs w:val="32"/>
+          <w:u w:val="single"/>
+          <w:lang w:bidi="en-US"/>
+        </w:rPr>
+        <w:t>SHAKTI KUMAR</w:t>
       </w:r>
     </w:p>
     <w:p>
@@ -1765,7 +1789,7 @@
           <w:u w:val="single"/>
           <w:lang w:bidi="en-US"/>
         </w:rPr>
-        <w:t>S</w:t>
+        <w:t>Prof. S</w:t>
       </w:r>
       <w:r>
         <w:rPr>
@@ -1917,14 +1941,40 @@
       </w:pPr>
       <w:r>
         <w:rPr>
+          <w:rFonts w:ascii="Arial" w:hAnsi="Arial" w:cs="Arial"/>
           <w:b/>
+          <w:bCs/>
+          <w:color w:val="FFFFFF"/>
+          <w:sz w:val="21"/>
+          <w:szCs w:val="21"/>
+          <w:shd w:val="clear" w:color="auto" w:fill="1B374C"/>
+        </w:rPr>
+        <w:t xml:space="preserve"> </w:t>
+      </w:r>
+      <w:r>
+        <w:rPr>
+          <w:b/>
+          <w:bCs/>
           <w:i/>
           <w:szCs w:val="24"/>
           <w:u w:val="single"/>
           <w:lang w:bidi="en-US"/>
         </w:rPr>
-        <w:t>Dean’s Name</w:t>
-      </w:r>
+        <w:t xml:space="preserve">Prof. Pawan Kumar </w:t>
+      </w:r>
+      <w:proofErr w:type="spellStart"/>
+      <w:r>
+        <w:rPr>
+          <w:b/>
+          <w:bCs/>
+          <w:i/>
+          <w:szCs w:val="24"/>
+          <w:u w:val="single"/>
+          <w:lang w:bidi="en-US"/>
+        </w:rPr>
+        <w:t>Kulriya</w:t>
+      </w:r>
+      <w:proofErr w:type="spellEnd"/>
     </w:p>
     <w:p>
       <w:pPr>
@@ -1940,6 +1990,13 @@
           <w:lang w:bidi="en-US"/>
         </w:rPr>
         <w:t xml:space="preserve"> (Dean</w:t>
+      </w:r>
+      <w:r>
+        <w:rPr>
+          <w:szCs w:val="24"/>
+          <w:lang w:bidi="en-US"/>
+        </w:rPr>
+        <w:t>)</w:t>
       </w:r>
     </w:p>
     <w:p>
@@ -1998,10 +2055,6 @@
         <w:jc w:val="left"/>
       </w:pPr>
       <w:r>
-        <w:br w:type="page"/>
-      </w:r>
-      <w:r>
-        <w:lastRenderedPageBreak/>
         <w:br w:type="page"/>
       </w:r>
     </w:p>
@@ -8545,8 +8598,8 @@
         </w:rPr>
         <w:lastRenderedPageBreak/>
         <w:drawing>
-          <wp:inline distT="0" distB="0" distL="0" distR="0" wp14:anchorId="51B0E5FD" wp14:editId="0A740696">
-            <wp:extent cx="5029200" cy="3771900"/>
+          <wp:inline distT="0" distB="0" distL="0" distR="0" wp14:anchorId="51B0E5FD" wp14:editId="0A627413">
+            <wp:extent cx="4978400" cy="3733800"/>
             <wp:effectExtent l="0" t="0" r="0" b="0"/>
             <wp:docPr id="3" name="Picture 3"/>
             <wp:cNvGraphicFramePr>
@@ -8568,7 +8621,7 @@
                   <pic:spPr>
                     <a:xfrm>
                       <a:off x="0" y="0"/>
-                      <a:ext cx="5029200" cy="3771900"/>
+                      <a:ext cx="5048245" cy="3786184"/>
                     </a:xfrm>
                     <a:prstGeom prst="rect">
                       <a:avLst/>
@@ -11486,7 +11539,6 @@
   <w:style w:type="character" w:default="1" w:styleId="DefaultParagraphFont">
     <w:name w:val="Default Paragraph Font"/>
     <w:uiPriority w:val="1"/>
-    <w:semiHidden/>
     <w:unhideWhenUsed/>
   </w:style>
   <w:style w:type="table" w:default="1" w:styleId="TableNormal">
@@ -22446,6 +22498,25 @@
       <w:szCs w:val="24"/>
     </w:rPr>
   </w:style>
+  <w:style w:type="paragraph" w:styleId="TableofFigures">
+    <w:name w:val="table of figures"/>
+    <w:basedOn w:val="Normal"/>
+    <w:next w:val="Normal"/>
+    <w:uiPriority w:val="99"/>
+    <w:unhideWhenUsed/>
+    <w:rsid w:val="00403862"/>
+    <w:pPr>
+      <w:spacing w:after="0"/>
+      <w:jc w:val="left"/>
+    </w:pPr>
+    <w:rPr>
+      <w:rFonts w:asciiTheme="minorHAnsi" w:hAnsiTheme="minorHAnsi"/>
+      <w:i/>
+      <w:iCs/>
+      <w:sz w:val="20"/>
+      <w:szCs w:val="24"/>
+    </w:rPr>
+  </w:style>
 </w:styles>
 </file>
 

</xml_diff>